<commit_message>
Add smart Groq Llama fallback to Liquid LFM service during upstream provider outages
</commit_message>
<xml_diff>
--- a/Documentation/gallery/multi_ai_ui_gallery_v2.docx
+++ b/Documentation/gallery/multi_ai_ui_gallery_v2.docx
@@ -619,11 +619,11 @@
               <a:graphicData uri="http://schemas.openxmlformats.org/drawingml/2006/picture">
                 <pic:pic>
                   <pic:nvPicPr>
-                    <pic:cNvPr id="0" name="workspace_output_custom.png"/>
+                    <pic:cNvPr id="0" name="workspace_output_midnight.png"/>
                     <pic:cNvPicPr/>
                   </pic:nvPicPr>
                   <pic:blipFill>
-                    <a:blip r:embed="rId15"/>
+                    <a:blip r:embed="rId11"/>
                     <a:stretch>
                       <a:fillRect/>
                     </a:stretch>
@@ -713,7 +713,7 @@
                     <pic:cNvPicPr/>
                   </pic:nvPicPr>
                   <pic:blipFill>
-                    <a:blip r:embed="rId16"/>
+                    <a:blip r:embed="rId15"/>
                     <a:stretch>
                       <a:fillRect/>
                     </a:stretch>
@@ -821,7 +821,7 @@
                     <pic:cNvPicPr/>
                   </pic:nvPicPr>
                   <pic:blipFill>
-                    <a:blip r:embed="rId17"/>
+                    <a:blip r:embed="rId16"/>
                     <a:stretch>
                       <a:fillRect/>
                     </a:stretch>
@@ -929,7 +929,7 @@
                     <pic:cNvPicPr/>
                   </pic:nvPicPr>
                   <pic:blipFill>
-                    <a:blip r:embed="rId18"/>
+                    <a:blip r:embed="rId17"/>
                     <a:stretch>
                       <a:fillRect/>
                     </a:stretch>
@@ -1037,7 +1037,7 @@
                     <pic:cNvPicPr/>
                   </pic:nvPicPr>
                   <pic:blipFill>
-                    <a:blip r:embed="rId19"/>
+                    <a:blip r:embed="rId18"/>
                     <a:stretch>
                       <a:fillRect/>
                     </a:stretch>
@@ -1145,7 +1145,7 @@
                     <pic:cNvPicPr/>
                   </pic:nvPicPr>
                   <pic:blipFill>
-                    <a:blip r:embed="rId20"/>
+                    <a:blip r:embed="rId19"/>
                     <a:stretch>
                       <a:fillRect/>
                     </a:stretch>
@@ -1253,7 +1253,7 @@
                     <pic:cNvPicPr/>
                   </pic:nvPicPr>
                   <pic:blipFill>
-                    <a:blip r:embed="rId21"/>
+                    <a:blip r:embed="rId20"/>
                     <a:stretch>
                       <a:fillRect/>
                     </a:stretch>

</xml_diff>

<commit_message>
Restore all mobile page views and observers, fix injection script matching line breaks
</commit_message>
<xml_diff>
--- a/Documentation/gallery/multi_ai_ui_gallery_v2.docx
+++ b/Documentation/gallery/multi_ai_ui_gallery_v2.docx
@@ -619,11 +619,11 @@
               <a:graphicData uri="http://schemas.openxmlformats.org/drawingml/2006/picture">
                 <pic:pic>
                   <pic:nvPicPr>
-                    <pic:cNvPr id="0" name="workspace_output_midnight.png"/>
+                    <pic:cNvPr id="0" name="workspace_output_custom.png"/>
                     <pic:cNvPicPr/>
                   </pic:nvPicPr>
                   <pic:blipFill>
-                    <a:blip r:embed="rId11"/>
+                    <a:blip r:embed="rId15"/>
                     <a:stretch>
                       <a:fillRect/>
                     </a:stretch>
@@ -713,7 +713,7 @@
                     <pic:cNvPicPr/>
                   </pic:nvPicPr>
                   <pic:blipFill>
-                    <a:blip r:embed="rId15"/>
+                    <a:blip r:embed="rId16"/>
                     <a:stretch>
                       <a:fillRect/>
                     </a:stretch>
@@ -821,7 +821,7 @@
                     <pic:cNvPicPr/>
                   </pic:nvPicPr>
                   <pic:blipFill>
-                    <a:blip r:embed="rId16"/>
+                    <a:blip r:embed="rId17"/>
                     <a:stretch>
                       <a:fillRect/>
                     </a:stretch>
@@ -929,7 +929,7 @@
                     <pic:cNvPicPr/>
                   </pic:nvPicPr>
                   <pic:blipFill>
-                    <a:blip r:embed="rId17"/>
+                    <a:blip r:embed="rId18"/>
                     <a:stretch>
                       <a:fillRect/>
                     </a:stretch>
@@ -1037,7 +1037,7 @@
                     <pic:cNvPicPr/>
                   </pic:nvPicPr>
                   <pic:blipFill>
-                    <a:blip r:embed="rId18"/>
+                    <a:blip r:embed="rId19"/>
                     <a:stretch>
                       <a:fillRect/>
                     </a:stretch>
@@ -1145,7 +1145,7 @@
                     <pic:cNvPicPr/>
                   </pic:nvPicPr>
                   <pic:blipFill>
-                    <a:blip r:embed="rId19"/>
+                    <a:blip r:embed="rId20"/>
                     <a:stretch>
                       <a:fillRect/>
                     </a:stretch>
@@ -1253,7 +1253,7 @@
                     <pic:cNvPicPr/>
                   </pic:nvPicPr>
                   <pic:blipFill>
-                    <a:blip r:embed="rId20"/>
+                    <a:blip r:embed="rId21"/>
                     <a:stretch>
                       <a:fillRect/>
                     </a:stretch>

</xml_diff>

<commit_message>
Revert mobile view files and CSS layout to fully functional state from commit 80bfb10
</commit_message>
<xml_diff>
--- a/Documentation/gallery/multi_ai_ui_gallery_v2.docx
+++ b/Documentation/gallery/multi_ai_ui_gallery_v2.docx
@@ -619,11 +619,11 @@
               <a:graphicData uri="http://schemas.openxmlformats.org/drawingml/2006/picture">
                 <pic:pic>
                   <pic:nvPicPr>
-                    <pic:cNvPr id="0" name="workspace_output_custom.png"/>
+                    <pic:cNvPr id="0" name="workspace_output_midnight.png"/>
                     <pic:cNvPicPr/>
                   </pic:nvPicPr>
                   <pic:blipFill>
-                    <a:blip r:embed="rId15"/>
+                    <a:blip r:embed="rId11"/>
                     <a:stretch>
                       <a:fillRect/>
                     </a:stretch>
@@ -713,7 +713,7 @@
                     <pic:cNvPicPr/>
                   </pic:nvPicPr>
                   <pic:blipFill>
-                    <a:blip r:embed="rId16"/>
+                    <a:blip r:embed="rId15"/>
                     <a:stretch>
                       <a:fillRect/>
                     </a:stretch>
@@ -821,7 +821,7 @@
                     <pic:cNvPicPr/>
                   </pic:nvPicPr>
                   <pic:blipFill>
-                    <a:blip r:embed="rId17"/>
+                    <a:blip r:embed="rId16"/>
                     <a:stretch>
                       <a:fillRect/>
                     </a:stretch>
@@ -929,7 +929,7 @@
                     <pic:cNvPicPr/>
                   </pic:nvPicPr>
                   <pic:blipFill>
-                    <a:blip r:embed="rId18"/>
+                    <a:blip r:embed="rId17"/>
                     <a:stretch>
                       <a:fillRect/>
                     </a:stretch>
@@ -1037,7 +1037,7 @@
                     <pic:cNvPicPr/>
                   </pic:nvPicPr>
                   <pic:blipFill>
-                    <a:blip r:embed="rId19"/>
+                    <a:blip r:embed="rId18"/>
                     <a:stretch>
                       <a:fillRect/>
                     </a:stretch>
@@ -1145,7 +1145,7 @@
                     <pic:cNvPicPr/>
                   </pic:nvPicPr>
                   <pic:blipFill>
-                    <a:blip r:embed="rId20"/>
+                    <a:blip r:embed="rId19"/>
                     <a:stretch>
                       <a:fillRect/>
                     </a:stretch>
@@ -1253,7 +1253,7 @@
                     <pic:cNvPicPr/>
                   </pic:nvPicPr>
                   <pic:blipFill>
-                    <a:blip r:embed="rId21"/>
+                    <a:blip r:embed="rId20"/>
                     <a:stretch>
                       <a:fillRect/>
                     </a:stretch>

</xml_diff>